<commit_message>
docs: refine customer manual wording
</commit_message>
<xml_diff>
--- a/docs/คู่มือ-Social-MKT-Data-Hub.docx
+++ b/docs/คู่มือ-Social-MKT-Data-Hub.docx
@@ -29,7 +29,7 @@
           <w:cs/>
           <w:lang w:val="th-TH" w:eastAsia="th-TH" w:bidi="th-TH"/>
         </w:rPr>
-        <w:t>เอกสารนี้อธิบายว่า Dashboard และตารางใน Lark Base ใช้ดูอะไร ข้อมูลมาจากไหน และมีเงื่อนไขอะไรที่ควรรู้ ระบบเก็บประวัติหลักไว้ใน Cloudflare D1 แล้วส่งข้อมูลที่ใช้ดูงานไปยัง Lark Base</w:t>
+        <w:t>คู่มือนี้อธิบายวิธีอ่าน Dashboard และตารางใน Lark Base รวมถึงที่มาของข้อมูลและเงื่อนไขสำคัญที่ควรรู้ ระบบเก็บประวัติหลักไว้ใน Cloudflare D1 และส่งข้อมูลที่ใช้ดูงานไปยัง Lark Base</w:t>
       </w:r>
     </w:p>
     <w:p>
@@ -43,7 +43,7 @@
           <w:cs/>
           <w:lang w:val="th-TH" w:eastAsia="th-TH" w:bidi="th-TH"/>
         </w:rPr>
-        <w:t>อ่านวันที่ให้ถูก</w:t>
+        <w:t>วิธีอ่านวันที่</w:t>
       </w:r>
     </w:p>
     <w:p>
@@ -70,7 +70,7 @@
           <w:cs/>
           <w:lang w:val="th-TH" w:eastAsia="th-TH" w:bidi="th-TH"/>
         </w:rPr>
-        <w:t xml:space="preserve"> = วันที่ของข้อมูล โดยรอบรายวันทั่วไปใช้วันล่าสุดที่จบสมบูรณ์แล้ว</w:t>
+        <w:t xml:space="preserve"> = วันที่ที่ตัวเลขนั้นเกิดขึ้น โดยรอบรายวันใช้วันล่าสุดที่ข้อมูลเสร็จสมบูรณ์แล้ว</w:t>
       </w:r>
     </w:p>
     <w:p>
@@ -97,7 +97,7 @@
           <w:cs/>
           <w:lang w:val="th-TH" w:eastAsia="th-TH" w:bidi="th-TH"/>
         </w:rPr>
-        <w:t xml:space="preserve"> = วันที่และเวลาที่ระบบเขียนข้อมูลปลายทางสำเร็จ จึงอาจใหม่กว่า </w:t>
+        <w:t xml:space="preserve"> = วันที่และเวลาที่เขียนข้อมูลลงปลายทางสำเร็จ จึงอาจเป็นวันถัดจาก </w:t>
       </w:r>
       <w:r>
         <w:rPr>
@@ -108,16 +108,6 @@
           <w:lang w:val="th-TH" w:eastAsia="th-TH" w:bidi="th-TH"/>
         </w:rPr>
         <w:t>metric_date</w:t>
-      </w:r>
-      <w:r>
-        <w:rPr>
-          <w:rFonts w:ascii="Arial Unicode MS" w:hAnsi="Arial Unicode MS" w:eastAsia="Arial Unicode MS" w:cs="Arial Unicode MS"/>
-          <w:color w:val="202020"/>
-          <w:sz w:val="19"/>
-          <w:cs/>
-          <w:lang w:val="th-TH" w:eastAsia="th-TH" w:bidi="th-TH"/>
-        </w:rPr>
-        <w:t xml:space="preserve"> 1 วัน</w:t>
       </w:r>
     </w:p>
     <w:p>
@@ -164,7 +154,7 @@
           <w:cs/>
           <w:lang w:val="th-TH" w:eastAsia="th-TH" w:bidi="th-TH"/>
         </w:rPr>
-        <w:t xml:space="preserve"> = ช่วงข้อมูลที่รายงานหรือสรุปใช้คำนวณ</w:t>
+        <w:t xml:space="preserve"> = วันแรกและวันสุดท้ายของช่วงที่ใช้คำนวณรายงาน</w:t>
       </w:r>
     </w:p>
     <w:p>
@@ -201,7 +191,7 @@
           <w:cs/>
           <w:lang w:val="th-TH" w:eastAsia="th-TH" w:bidi="th-TH"/>
         </w:rPr>
-        <w:t xml:space="preserve"> คือแหล่งข้อมูลยืนยันว่าเป็นศูนย์ ส่วนข้อมูลที่ไม่มีหรือยังไม่พร้อมจะแสดงเป็นว่าง/</w:t>
+        <w:t xml:space="preserve"> หมายถึงแหล่งข้อมูลยืนยันว่าเป็นศูนย์ ส่วนข้อมูลที่ไม่มีหรือยังไม่พร้อมจะแสดงเป็นช่องว่างหรือ </w:t>
       </w:r>
       <w:r>
         <w:rPr>
@@ -240,7 +230,7 @@
           <w:cs/>
           <w:lang w:val="th-TH" w:eastAsia="th-TH" w:bidi="th-TH"/>
         </w:rPr>
-        <w:t xml:space="preserve">Dashboard อ่านจากชุดรายงานที่ระบบคำนวณและตรวจความครบถ้วนแล้ว ไม่ได้อ่านข้อมูลดิบโดยตรง ตัวกรองหลักคือ Platform, Account และช่วงเวลา </w:t>
+        <w:t xml:space="preserve">ตัวเลขบน Dashboard มาจากรายงานที่ระบบคำนวณและตรวจความครบถ้วนแล้ว ผู้ใช้กรองข้อมูลตาม Platform, Account และช่วงเวลา </w:t>
       </w:r>
       <w:r>
         <w:rPr>
@@ -312,7 +302,7 @@
           <w:cs/>
           <w:lang w:val="th-TH" w:eastAsia="th-TH" w:bidi="th-TH"/>
         </w:rPr>
-        <w:t xml:space="preserve"> หากข้อมูลฐานสำหรับเปรียบเทียบยังไม่ครบ ระบบจะแสดงว่างหรือ </w:t>
+        <w:t xml:space="preserve"> ได้ หากข้อมูลฐานสำหรับเปรียบเทียบยังไม่ครบ ช่องนั้นจะแสดงเป็นช่องว่างหรือ </w:t>
       </w:r>
       <w:r>
         <w:rPr>
@@ -330,7 +320,7 @@
           <w:cs/>
           <w:lang w:val="th-TH" w:eastAsia="th-TH" w:bidi="th-TH"/>
         </w:rPr>
-        <w:t xml:space="preserve"> แทนการใส่ศูนย์</w:t>
+        <w:t xml:space="preserve"> โดยไม่ใช้เลขศูนย์แทนข้อมูลที่ขาด</w:t>
       </w:r>
     </w:p>
     <w:p>
@@ -364,7 +354,7 @@
           <w:cs/>
           <w:lang w:val="th-TH" w:eastAsia="th-TH" w:bidi="th-TH"/>
         </w:rPr>
-        <w:t>หน้าสรุปสำหรับดูภาพรวมทุกด้านในหน้าเดียว</w:t>
+        <w:t>ใช้ดูภาพรวม Organic, Paid Ads, ยอดขาย และงานบริการลูกค้าในหน้าเดียว</w:t>
       </w:r>
     </w:p>
     <w:tbl>
@@ -897,7 +887,7 @@
                 <w:cs/>
                 <w:lang w:val="th-TH" w:eastAsia="th-TH" w:bidi="th-TH"/>
               </w:rPr>
-              <w:t>ยอดขายสุทธิหลังหักรายการที่ระบบกำหนด หน่วยเป็นสกุลเงินของร้าน</w:t>
+              <w:t>ยอดขายสุทธิหลังหักส่วนลด คืนเงิน และรายการปรับปรุงตามนิยามของร้าน</w:t>
             </w:r>
           </w:p>
         </w:tc>
@@ -1597,7 +1587,7 @@
                 <w:cs/>
                 <w:lang w:val="th-TH" w:eastAsia="th-TH" w:bidi="th-TH"/>
               </w:rPr>
-              <w:t xml:space="preserve">ความครบถ้วนของช่วงข้อมูลและเหตุผลเมื่อบาง Metric ยังเป็น </w:t>
+              <w:t xml:space="preserve">ความครบถ้วนของช่วงข้อมูลและสาเหตุที่บางค่าแสดงเป็น </w:t>
             </w:r>
             <w:r>
               <w:rPr>
@@ -2865,7 +2855,7 @@
                 <w:cs/>
                 <w:lang w:val="th-TH" w:eastAsia="th-TH" w:bidi="th-TH"/>
               </w:rPr>
-              <w:t>ตัวเลขตรวจข้อมูล</w:t>
+              <w:t>จำนวนรายการ</w:t>
             </w:r>
           </w:p>
         </w:tc>
@@ -2953,7 +2943,7 @@
                 <w:cs/>
                 <w:lang w:val="th-TH" w:eastAsia="th-TH" w:bidi="th-TH"/>
               </w:rPr>
-              <w:t>ตัวเลขตรวจข้อมูล</w:t>
+              <w:t>จำนวนรายการ</w:t>
             </w:r>
           </w:p>
         </w:tc>
@@ -3040,7 +3030,7 @@
                 <w:cs/>
                 <w:lang w:val="th-TH" w:eastAsia="th-TH" w:bidi="th-TH"/>
               </w:rPr>
-              <w:t>ตัวเลขตรวจข้อมูล</w:t>
+              <w:t>จำนวนรายการ</w:t>
             </w:r>
           </w:p>
         </w:tc>
@@ -3128,7 +3118,7 @@
                 <w:cs/>
                 <w:lang w:val="th-TH" w:eastAsia="th-TH" w:bidi="th-TH"/>
               </w:rPr>
-              <w:t>ตัวเลขตรวจข้อมูล</w:t>
+              <w:t>จำนวนรายการ</w:t>
             </w:r>
           </w:p>
         </w:tc>
@@ -5294,7 +5284,7 @@
                 <w:cs/>
                 <w:lang w:val="th-TH" w:eastAsia="th-TH" w:bidi="th-TH"/>
               </w:rPr>
-              <w:t>ยอดขายก่อนหักรายการ แยกตามช่วงที่เลือก</w:t>
+              <w:t>ยอดขายก่อนหักส่วนลด คืนเงิน และรายการปรับปรุง แยกตามช่วงที่เลือก</w:t>
             </w:r>
           </w:p>
         </w:tc>
@@ -5586,7 +5576,7 @@
                 <w:cs/>
                 <w:lang w:val="th-TH" w:eastAsia="th-TH" w:bidi="th-TH"/>
               </w:rPr>
-              <w:t>อันดับสินค้า/ช่องทางชำระ/การจัดส่ง</w:t>
+              <w:t>อันดับสินค้า วิธีชำระเงิน และวิธีจัดส่ง</w:t>
             </w:r>
           </w:p>
         </w:tc>
@@ -5644,7 +5634,7 @@
                 <w:cs/>
                 <w:lang w:val="th-TH" w:eastAsia="th-TH" w:bidi="th-TH"/>
               </w:rPr>
-              <w:t>รายการอันดับและยอดขายที่เกี่ยวข้อง เมื่อชุดรายงานมีข้อมูลส่วนนั้น</w:t>
+              <w:t>อันดับและยอดขายที่เกี่ยวข้อง เมื่อแหล่งข้อมูลมีรายละเอียดส่วนนั้น</w:t>
             </w:r>
           </w:p>
         </w:tc>
@@ -5767,7 +5757,7 @@
           <w:cs/>
           <w:lang w:val="th-TH" w:eastAsia="th-TH" w:bidi="th-TH"/>
         </w:rPr>
-        <w:t>ใช้ดูงานบริการลูกค้าจาก Chatwoot โดยดึงเฉพาะ Conversation ใหม่หรือรายการที่มีการเปลี่ยนแปลง</w:t>
+        <w:t>ใช้ดูงานบริการลูกค้าจาก Chatwoot โดยนำเข้าเฉพาะ Conversation ใหม่และรายการเดิมที่มีการอัปเดต</w:t>
       </w:r>
     </w:p>
     <w:tbl>
@@ -6230,7 +6220,7 @@
                 <w:cs/>
                 <w:lang w:val="th-TH" w:eastAsia="th-TH" w:bidi="th-TH"/>
               </w:rPr>
-              <w:t>จำนวน Conversation ที่ปิดหรือแก้ไขเสร็จในช่วงที่เลือก</w:t>
+              <w:t>จำนวน Conversation ที่ปิดงานแล้วในช่วงที่เลือก</w:t>
             </w:r>
           </w:p>
         </w:tc>
@@ -6405,7 +6395,7 @@
                 <w:cs/>
                 <w:lang w:val="th-TH" w:eastAsia="th-TH" w:bidi="th-TH"/>
               </w:rPr>
-              <w:t>เวลาเฉลี่ยก่อนตอบลูกค้าครั้งแรก</w:t>
+              <w:t>เวลาเฉลี่ยตั้งแต่ลูกค้าเริ่ม Conversation จนได้รับคำตอบครั้งแรก</w:t>
             </w:r>
           </w:p>
         </w:tc>
@@ -6491,7 +6481,7 @@
                 <w:cs/>
                 <w:lang w:val="th-TH" w:eastAsia="th-TH" w:bidi="th-TH"/>
               </w:rPr>
-              <w:t>เวลาเฉลี่ยตั้งแต่เปิดจนปิด Conversation</w:t>
+              <w:t>เวลาเฉลี่ยตั้งแต่เปิด Conversation จนปิดงาน</w:t>
             </w:r>
           </w:p>
         </w:tc>
@@ -6666,7 +6656,7 @@
                 <w:cs/>
                 <w:lang w:val="th-TH" w:eastAsia="th-TH" w:bidi="th-TH"/>
               </w:rPr>
-              <w:t>จำนวนงานและเวลาตอบของ Agent หรือ Inbox เมื่อชุดรายงานมีข้อมูลจัดอันดับ</w:t>
+              <w:t>จำนวนงานและเวลาตอบแยกตาม Agent หรือ Inbox เมื่อมีข้อมูลเพียงพอ</w:t>
             </w:r>
           </w:p>
         </w:tc>
@@ -6792,7 +6782,7 @@
           <w:cs/>
           <w:lang w:val="th-TH" w:eastAsia="th-TH" w:bidi="th-TH"/>
         </w:rPr>
-        <w:t>หน้าตรวจสุขภาพระบบ ใช้แยกกรณี “ไม่มีข้อมูลจริง” ออกจาก “ข้อมูลยังมาไม่ครบ”</w:t>
+        <w:t>ใช้ตรวจสุขภาพระบบ และช่วยแยกว่าค่าเป็นศูนย์จริงหรือข้อมูลยังมาไม่ครบ</w:t>
       </w:r>
     </w:p>
     <w:tbl>
@@ -7325,7 +7315,7 @@
                 <w:cs/>
                 <w:lang w:val="th-TH" w:eastAsia="th-TH" w:bidi="th-TH"/>
               </w:rPr>
-              <w:t>ผล Sync ล่าสุดของแต่ละช่องทาง งานที่กำลังทำ และงานที่ต้องตรวจ</w:t>
+              <w:t>สถานะ Sync ล่าสุดของแต่ละช่องทาง รวมถึงงานที่กำลังทำและงานที่ควรตรวจสอบ</w:t>
             </w:r>
           </w:p>
         </w:tc>
@@ -7411,7 +7401,7 @@
                 <w:cs/>
                 <w:lang w:val="th-TH" w:eastAsia="th-TH" w:bidi="th-TH"/>
               </w:rPr>
-              <w:t>ระดับความสำคัญ สาเหตุ เวลาเกิด สถานะเปิด/แก้แล้ว และช่องทางที่เกี่ยวข้อง</w:t>
+              <w:t>ระดับความสำคัญ สาเหตุ เวลาเกิด สถานะปัจจุบัน และช่องทางที่เกี่ยวข้อง</w:t>
             </w:r>
           </w:p>
         </w:tc>
@@ -7434,7 +7424,7 @@
           <w:cs/>
           <w:lang w:val="th-TH" w:eastAsia="th-TH" w:bidi="th-TH"/>
         </w:rPr>
-        <w:t xml:space="preserve">ค่าบน Dashboard มาจาก </w:t>
+        <w:t xml:space="preserve">ตัวเลขบน Dashboard มาจาก </w:t>
       </w:r>
       <w:r>
         <w:rPr>
@@ -7506,7 +7496,7 @@
           <w:cs/>
           <w:lang w:val="th-TH" w:eastAsia="th-TH" w:bidi="th-TH"/>
         </w:rPr>
-        <w:t xml:space="preserve"> ส่วนสถานะงานและปัญหาอ้างอิง </w:t>
+        <w:t xml:space="preserve"> ส่วนสถานะการ Sync และปัญหาของระบบอ้างอิงจาก </w:t>
       </w:r>
       <w:r>
         <w:rPr>
@@ -7524,7 +7514,7 @@
           <w:cs/>
           <w:lang w:val="th-TH" w:eastAsia="th-TH" w:bidi="th-TH"/>
         </w:rPr>
-        <w:t xml:space="preserve"> กับ </w:t>
+        <w:t xml:space="preserve"> และ </w:t>
       </w:r>
       <w:r>
         <w:rPr>
@@ -7932,7 +7922,7 @@
                 <w:cs/>
                 <w:lang w:val="th-TH" w:eastAsia="th-TH" w:bidi="th-TH"/>
               </w:rPr>
-              <w:t>ความหมาย หน่วย และวิธีอ่านแต่ละ Metric</w:t>
+              <w:t>คำอธิบาย หน่วย และวิธีอ่านแต่ละ Metric</w:t>
             </w:r>
           </w:p>
         </w:tc>
@@ -8020,7 +8010,7 @@
                 <w:cs/>
                 <w:lang w:val="th-TH" w:eastAsia="th-TH" w:bidi="th-TH"/>
               </w:rPr>
-              <w:t>กฎ/คำสำหรับจัดหมวดหมู่ Content หรือ Campaign</w:t>
+              <w:t>คำและกฎที่ใช้จัดหมวดหมู่ Content หรือ Campaign</w:t>
             </w:r>
           </w:p>
         </w:tc>
@@ -8330,7 +8320,7 @@
                 <w:cs/>
                 <w:lang w:val="th-TH" w:eastAsia="th-TH" w:bidi="th-TH"/>
               </w:rPr>
-              <w:t>Snapshot ตัวเลขของแต่ละ Content ในแต่ละวัน</w:t>
+              <w:t>ตัวเลขของแต่ละ Content แยกตามวัน</w:t>
             </w:r>
           </w:p>
         </w:tc>
@@ -8417,7 +8407,7 @@
                 <w:cs/>
                 <w:lang w:val="th-TH" w:eastAsia="th-TH" w:bidi="th-TH"/>
               </w:rPr>
-              <w:t>แหล่งข้อมูล TikTok Native ที่เชื่อมกับ Lark</w:t>
+              <w:t>ข้อมูล TikTok ที่เชื่อมผ่าน Lark Native</w:t>
             </w:r>
           </w:p>
         </w:tc>
@@ -8445,7 +8435,7 @@
                 <w:cs/>
                 <w:lang w:val="th-TH" w:eastAsia="th-TH" w:bidi="th-TH"/>
               </w:rPr>
-              <w:t>อ่านอย่างเดียว ห้ามแก้ schema หรือข้อมูลด้วยระบบ Sync</w:t>
+              <w:t>อ่านอย่างเดียว ห้ามแก้ Schema หรือข้อมูลด้วยระบบ Sync</w:t>
             </w:r>
           </w:p>
         </w:tc>
@@ -9191,7 +9181,7 @@
                 <w:cs/>
                 <w:lang w:val="th-TH" w:eastAsia="th-TH" w:bidi="th-TH"/>
               </w:rPr>
-              <w:t>Lark เก็บช่วงล่าสุดแบบ bounded cache; เป้าหมาย 90 วัน และ D1 เก็บประวัติเต็ม</w:t>
+              <w:t>Lark เก็บข้อมูลช่วงล่าสุด โดยมีเป้าหมายย้อนหลัง 90 วัน ส่วนประวัติเต็มยังอยู่ใน D1</w:t>
             </w:r>
           </w:p>
         </w:tc>
@@ -9280,7 +9270,7 @@
                 <w:cs/>
                 <w:lang w:val="th-TH" w:eastAsia="th-TH" w:bidi="th-TH"/>
               </w:rPr>
-              <w:t>เดือนปัจจุบันเป็น MTD และอัปเดตรายวัน; เดือนปิดแล้วคงเดิม; มี Views Overview/Meta/Google/TikTok และไม่สร้าง duplicate</w:t>
+              <w:t>เดือนปัจจุบันเป็น MTD และอัปเดตรายวัน; เดือนที่ปิดแล้วจะคงเดิม; มี Views Overview/Meta/Google/TikTok และไม่สร้างแถวซ้ำ</w:t>
             </w:r>
           </w:p>
         </w:tc>
@@ -9648,7 +9638,7 @@
                 <w:cs/>
                 <w:lang w:val="th-TH" w:eastAsia="th-TH" w:bidi="th-TH"/>
               </w:rPr>
-              <w:t>ลูกค้าและยอดสะสมที่ระบบอนุญาตให้แสดง</w:t>
+              <w:t>ข้อมูลลูกค้าและยอดสะสมที่ใช้ในรายงาน</w:t>
             </w:r>
           </w:p>
         </w:tc>
@@ -9676,7 +9666,7 @@
                 <w:cs/>
                 <w:lang w:val="th-TH" w:eastAsia="th-TH" w:bidi="th-TH"/>
               </w:rPr>
-              <w:t>1 แถวต่อลูกค้า; ไม่แสดง Secret/Credential</w:t>
+              <w:t>1 แถวต่อลูกค้า; ไม่แสดง Secret หรือ Credential</w:t>
             </w:r>
           </w:p>
         </w:tc>
@@ -10072,7 +10062,7 @@
                 <w:cs/>
                 <w:lang w:val="th-TH" w:eastAsia="th-TH" w:bidi="th-TH"/>
               </w:rPr>
-              <w:t>อ่านเฉพาะรายการใหม่หรือรายการที่มี revision ใหม่กว่า D1</w:t>
+              <w:t>นำเข้าเฉพาะรายการใหม่หรือรายการที่มี Revision ใหม่กว่าใน D1</w:t>
             </w:r>
           </w:p>
         </w:tc>
@@ -10132,7 +10122,7 @@
                 <w:cs/>
                 <w:lang w:val="th-TH" w:eastAsia="th-TH" w:bidi="th-TH"/>
               </w:rPr>
-              <w:t>สถิติ Conversation รายวัน</w:t>
+              <w:t>ตัวเลขของแต่ละ Conversation แยกตามวัน</w:t>
             </w:r>
           </w:p>
         </w:tc>
@@ -10161,7 +10151,7 @@
                 <w:cs/>
                 <w:lang w:val="th-TH" w:eastAsia="th-TH" w:bidi="th-TH"/>
               </w:rPr>
-              <w:t>สรุปตามวันที่และ Conversation</w:t>
+              <w:t>1 แถวต่อ Conversation ต่อวันที่ข้อมูล</w:t>
             </w:r>
           </w:p>
         </w:tc>
@@ -10703,7 +10693,7 @@
                 <w:cs/>
                 <w:lang w:val="th-TH" w:eastAsia="th-TH" w:bidi="th-TH"/>
               </w:rPr>
-              <w:t>หัวรายงานของแต่ละ Platform/ช่วงเวลา</w:t>
+              <w:t>ข้อมูลหลักของรายงานแต่ละ Platform และช่วงเวลา</w:t>
             </w:r>
           </w:p>
         </w:tc>
@@ -10732,7 +10722,7 @@
                 <w:cs/>
                 <w:lang w:val="th-TH" w:eastAsia="th-TH" w:bidi="th-TH"/>
               </w:rPr>
-              <w:t>สร้างจากข้อมูล D1 ที่ผ่าน Coverage gate</w:t>
+              <w:t>สร้างจากข้อมูล D1 ที่ผ่านการตรวจความครบถ้วนแล้ว</w:t>
             </w:r>
           </w:p>
         </w:tc>
@@ -11073,7 +11063,7 @@
                 <w:cs/>
                 <w:lang w:val="th-TH" w:eastAsia="th-TH" w:bidi="th-TH"/>
               </w:rPr>
-              <w:t>สรุป AI สถานะการสร้าง และหลักฐานอ้างอิง</w:t>
+              <w:t>สรุปจาก AI สถานะการสร้าง และข้อมูลอ้างอิง</w:t>
             </w:r>
           </w:p>
         </w:tc>
@@ -11102,7 +11092,7 @@
                 <w:cs/>
                 <w:lang w:val="th-TH" w:eastAsia="th-TH" w:bidi="th-TH"/>
               </w:rPr>
-              <w:t>AI อธิบายตัวเลขที่ระบบคำนวณแล้ว ไม่คำนวณตัวเลขเอง</w:t>
+              <w:t>AI เขียนคำอธิบายจากตัวเลขที่ระบบคำนวณแล้ว ไม่ได้คำนวณตัวเลขเอง</w:t>
             </w:r>
           </w:p>
         </w:tc>
@@ -11188,7 +11178,7 @@
                 <w:cs/>
                 <w:lang w:val="th-TH" w:eastAsia="th-TH" w:bidi="th-TH"/>
               </w:rPr>
-              <w:t>1 รายการต่อเอกลักษณ์การส่ง; ป้องกันการส่งซ้ำ</w:t>
+              <w:t>การส่งแต่ละครั้งมีรหัสเฉพาะเพื่อป้องกันข้อความซ้ำ</w:t>
             </w:r>
           </w:p>
         </w:tc>
@@ -11409,7 +11399,7 @@
                 <w:cs/>
                 <w:lang w:val="th-TH" w:eastAsia="th-TH" w:bidi="th-TH"/>
               </w:rPr>
-              <w:t>ใช้ตรวจย้อนหลัง ไม่ใช่ข้อมูลธุรกิจ</w:t>
+              <w:t>ใช้ตรวจประวัติการทำงาน ไม่ใช่ข้อมูลธุรกิจ</w:t>
             </w:r>
           </w:p>
         </w:tc>
@@ -11535,7 +11525,7 @@
           <w:cs/>
           <w:lang w:val="th-TH" w:eastAsia="th-TH" w:bidi="th-TH"/>
         </w:rPr>
-        <w:t>Cloudflare เป็นฝั่งประมวลผลและเก็บประวัติหลัก ลูกค้าไม่ควรแก้ข้อมูลใน D1 ด้วยมือ.</w:t>
+        <w:t>Cloudflare เป็นส่วนที่ประมวลผลและเก็บประวัติหลัก จึงไม่ควรแก้ข้อมูลใน D1 ด้วยมือ</w:t>
       </w:r>
     </w:p>
     <w:tbl>
@@ -11923,7 +11913,7 @@
                 <w:cs/>
                 <w:lang w:val="th-TH" w:eastAsia="th-TH" w:bidi="th-TH"/>
               </w:rPr>
-              <w:t>Campaign/Ad ปัจจุบัน, Metric รายวัน และ Conversion revision</w:t>
+              <w:t>สถานะ Campaign/Ad ล่าสุด, Metric รายวัน และประวัติการเปลี่ยนแปลงของ Conversion</w:t>
             </w:r>
           </w:p>
         </w:tc>
@@ -12353,7 +12343,7 @@
                 <w:cs/>
                 <w:lang w:val="th-TH" w:eastAsia="th-TH" w:bidi="th-TH"/>
               </w:rPr>
-              <w:t>สถานะ claim/send/mirror เพื่อให้ส่งข้อความ exactly once</w:t>
+              <w:t>สถานะการจองงาน ส่งข้อความ และบันทึกผล เพื่อป้องกันการส่งซ้ำ</w:t>
             </w:r>
           </w:p>
         </w:tc>
@@ -12668,7 +12658,7 @@
                 <w:cs/>
                 <w:lang w:val="th-TH" w:eastAsia="th-TH" w:bidi="th-TH"/>
               </w:rPr>
-              <w:t>งาน Sync, checkpoint, lock และความคืบหน้าแบบทำต่อจากจุดเดิมได้</w:t>
+              <w:t>งาน Sync จุดบันทึกความคืบหน้า และสถานะล็อก เพื่อให้ระบบทำต่อจากจุดเดิมได้</w:t>
             </w:r>
           </w:p>
         </w:tc>
@@ -12834,7 +12824,7 @@
                 <w:cs/>
                 <w:lang w:val="th-TH" w:eastAsia="th-TH" w:bidi="th-TH"/>
               </w:rPr>
-              <w:t>ความพยายามของ Queue, งานที่ล้มเหลว และ Alert สำหรับกู้คืนแบบควบคุม</w:t>
+              <w:t>ประวัติการทำงานของ Queue งานที่ล้มเหลว และการแจ้งเตือนสำหรับการกู้คืนแบบควบคุม</w:t>
             </w:r>
           </w:p>
         </w:tc>
@@ -13003,7 +12993,7 @@
                 <w:cs/>
                 <w:lang w:val="th-TH" w:eastAsia="th-TH" w:bidi="th-TH"/>
               </w:rPr>
-              <w:t>การเชื่อมบัญชีและ credential ที่เข้ารหัสแล้ว</w:t>
+              <w:t>ข้อมูลการเชื่อมบัญชีและ Credential ที่เข้ารหัสแล้ว</w:t>
             </w:r>
           </w:p>
         </w:tc>
@@ -13129,7 +13119,7 @@
                 <w:cs/>
                 <w:lang w:val="th-TH" w:eastAsia="th-TH" w:bidi="th-TH"/>
               </w:rPr>
-              <w:t>การรับ batch จาก Manager Script, nonce และหลักฐานการยืนยันตัวตน</w:t>
+              <w:t>ชุดข้อมูลที่รับจาก Manager Script และหลักฐานยืนยันคำขอ</w:t>
             </w:r>
           </w:p>
         </w:tc>
@@ -13168,7 +13158,7 @@
           <w:cs/>
           <w:lang w:val="th-TH" w:eastAsia="th-TH" w:bidi="th-TH"/>
         </w:rPr>
-        <w:t>อย่าแก้ Primary/Stable key, Platform, Account ID หรือวันที่ด้วยมือ เพราะใช้กันข้อมูลซ้ำและใช้ reconcile กับ D1</w:t>
+        <w:t>อย่าแก้ Primary/Stable key, Platform, Account ID หรือวันที่ด้วยมือ เพราะระบบใช้ข้อมูลเหล่านี้ป้องกันแถวซ้ำและตรวจเทียบกับ D1</w:t>
       </w:r>
     </w:p>
     <w:p>
@@ -13185,7 +13175,7 @@
           <w:cs/>
           <w:lang w:val="th-TH" w:eastAsia="th-TH" w:bidi="th-TH"/>
         </w:rPr>
-        <w:t>ตาราง Daily ใน Lark เป็นชั้นแสดงผล/แคช; การลดจำนวนแถวใน Lark ไม่ใช่การลบประวัติจาก D1</w:t>
+        <w:t>ตาราง Daily ใน Lark ใช้แสดงผลและเก็บข้อมูลช่วงล่าสุด การลดจำนวนแถวใน Lark ไม่ได้ลบประวัติที่เก็บไว้ใน D1</w:t>
       </w:r>
     </w:p>
     <w:p>

</xml_diff>